<commit_message>
New and improved doc with source
</commit_message>
<xml_diff>
--- a/rf and boosting.docx
+++ b/rf and boosting.docx
@@ -63,21 +63,85 @@
         <w:rPr>
           <w:rFonts w:ascii="Times New Roman" w:hAnsi="Times New Roman" w:cs="Times New Roman"/>
         </w:rPr>
-        <w:t xml:space="preserve">Bagging uses a </w:t>
-      </w:r>
-      <w:proofErr w:type="gramStart"/>
-      <w:r>
-        <w:rPr>
-          <w:rFonts w:ascii="Times New Roman" w:hAnsi="Times New Roman" w:cs="Times New Roman"/>
-        </w:rPr>
-        <w:t>tree based</w:t>
-      </w:r>
-      <w:proofErr w:type="gramEnd"/>
-      <w:r>
-        <w:rPr>
-          <w:rFonts w:ascii="Times New Roman" w:hAnsi="Times New Roman" w:cs="Times New Roman"/>
-        </w:rPr>
-        <w:t xml:space="preserve"> method and bootstrapping by taking repeated samples from the same training set.</w:t>
+        <w:t xml:space="preserve">Bootstrap aggregation or </w:t>
+      </w:r>
+      <w:r>
+        <w:rPr>
+          <w:rFonts w:ascii="Times New Roman" w:hAnsi="Times New Roman" w:cs="Times New Roman"/>
+        </w:rPr>
+        <w:t>b</w:t>
+      </w:r>
+      <w:r>
+        <w:rPr>
+          <w:rFonts w:ascii="Times New Roman" w:hAnsi="Times New Roman" w:cs="Times New Roman"/>
+        </w:rPr>
+        <w:t>agging uses a tree based method and bootstrapping by taking repeated samples from the same training set</w:t>
+      </w:r>
+      <w:r>
+        <w:rPr>
+          <w:rFonts w:ascii="Times New Roman" w:hAnsi="Times New Roman" w:cs="Times New Roman"/>
+        </w:rPr>
+        <w:t xml:space="preserve"> and</w:t>
+      </w:r>
+      <w:r>
+        <w:rPr>
+          <w:rFonts w:ascii="Times New Roman" w:hAnsi="Times New Roman" w:cs="Times New Roman"/>
+        </w:rPr>
+        <w:t xml:space="preserve"> tak</w:t>
+      </w:r>
+      <w:r>
+        <w:rPr>
+          <w:rFonts w:ascii="Times New Roman" w:hAnsi="Times New Roman" w:cs="Times New Roman"/>
+        </w:rPr>
+        <w:t>ing</w:t>
+      </w:r>
+      <w:r>
+        <w:rPr>
+          <w:rFonts w:ascii="Times New Roman" w:hAnsi="Times New Roman" w:cs="Times New Roman"/>
+        </w:rPr>
+        <w:t xml:space="preserve"> the average of the models</w:t>
+      </w:r>
+      <w:r>
+        <w:rPr>
+          <w:rFonts w:ascii="Times New Roman" w:hAnsi="Times New Roman" w:cs="Times New Roman"/>
+        </w:rPr>
+        <w:t xml:space="preserve">, </w:t>
+      </w:r>
+      <w:r>
+        <w:rPr>
+          <w:rFonts w:ascii="Times New Roman" w:hAnsi="Times New Roman" w:cs="Times New Roman"/>
+        </w:rPr>
+        <w:t xml:space="preserve">to </w:t>
+      </w:r>
+      <w:r>
+        <w:rPr>
+          <w:rFonts w:ascii="Times New Roman" w:hAnsi="Times New Roman" w:cs="Times New Roman"/>
+        </w:rPr>
+        <w:t xml:space="preserve">make a new model that </w:t>
+      </w:r>
+      <w:r>
+        <w:rPr>
+          <w:rFonts w:ascii="Times New Roman" w:hAnsi="Times New Roman" w:cs="Times New Roman"/>
+        </w:rPr>
+        <w:t>reduce</w:t>
+      </w:r>
+      <w:r>
+        <w:rPr>
+          <w:rFonts w:ascii="Times New Roman" w:hAnsi="Times New Roman" w:cs="Times New Roman"/>
+        </w:rPr>
+        <w:t>s</w:t>
+      </w:r>
+      <w:r>
+        <w:rPr>
+          <w:rFonts w:ascii="Times New Roman" w:hAnsi="Times New Roman" w:cs="Times New Roman"/>
+        </w:rPr>
+        <w:t xml:space="preserve"> the variance</w:t>
+      </w:r>
+      <w:r>
+        <w:rPr>
+          <w:rFonts w:ascii="Times New Roman" w:hAnsi="Times New Roman" w:cs="Times New Roman"/>
+        </w:rPr>
+        <w:t>.</w:t>
       </w:r>
       <w:r>
         <w:rPr>
@@ -120,6 +184,24 @@
           <w:rFonts w:ascii="Times New Roman" w:hAnsi="Times New Roman" w:cs="Times New Roman"/>
         </w:rPr>
         <w:t>and therefore be a more reliable prediction. Random forest is especially helpful when we have many highly correlated predictors.</w:t>
+      </w:r>
+      <w:r>
+        <w:rPr>
+          <w:rFonts w:ascii="Times New Roman" w:hAnsi="Times New Roman" w:cs="Times New Roman"/>
+        </w:rPr>
+        <w:t xml:space="preserve"> When using random forest for </w:t>
+      </w:r>
+      <w:r>
+        <w:rPr>
+          <w:rFonts w:ascii="Times New Roman" w:hAnsi="Times New Roman" w:cs="Times New Roman"/>
+        </w:rPr>
+        <w:t>predicting a categorical variable</w:t>
+      </w:r>
+      <w:r>
+        <w:rPr>
+          <w:rFonts w:ascii="Times New Roman" w:hAnsi="Times New Roman" w:cs="Times New Roman"/>
+        </w:rPr>
+        <w:t xml:space="preserve"> we record each class predicted by each tree and we predict the class with the majority.</w:t>
       </w:r>
     </w:p>
     <w:p>
@@ -184,19 +266,99 @@
         </w:rPr>
         <w:t xml:space="preserve">Boosting does this by having three tuning parameters the number of trees, a shrinkage parameter, and the number of splits. In </w:t>
       </w:r>
-      <w:proofErr w:type="gramStart"/>
-      <w:r>
-        <w:rPr>
-          <w:rFonts w:ascii="Times New Roman" w:hAnsi="Times New Roman" w:cs="Times New Roman"/>
-        </w:rPr>
-        <w:t>general</w:t>
-      </w:r>
-      <w:proofErr w:type="gramEnd"/>
+      <w:r>
+        <w:rPr>
+          <w:rFonts w:ascii="Times New Roman" w:hAnsi="Times New Roman" w:cs="Times New Roman"/>
+        </w:rPr>
+        <w:t>general,</w:t>
+      </w:r>
       <w:r>
         <w:rPr>
           <w:rFonts w:ascii="Times New Roman" w:hAnsi="Times New Roman" w:cs="Times New Roman"/>
         </w:rPr>
         <w:t xml:space="preserve"> this model outperforms a random forest model.</w:t>
+      </w:r>
+      <w:r>
+        <w:rPr>
+          <w:rFonts w:ascii="Times New Roman" w:hAnsi="Times New Roman" w:cs="Times New Roman"/>
+        </w:rPr>
+        <w:t xml:space="preserve"> For categorical predictions the </w:t>
+      </w:r>
+      <w:r>
+        <w:rPr>
+          <w:rFonts w:ascii="Times New Roman" w:hAnsi="Times New Roman" w:cs="Times New Roman"/>
+        </w:rPr>
+        <w:t>boosting is similar</w:t>
+      </w:r>
+      <w:r>
+        <w:rPr>
+          <w:rFonts w:ascii="Times New Roman" w:hAnsi="Times New Roman" w:cs="Times New Roman"/>
+        </w:rPr>
+        <w:t xml:space="preserve"> but different as it uses </w:t>
+      </w:r>
+      <w:r>
+        <w:rPr>
+          <w:rFonts w:ascii="Times New Roman" w:hAnsi="Times New Roman" w:cs="Times New Roman"/>
+        </w:rPr>
+        <w:t>binomial deviance rather than least square error like in the regression version</w:t>
+      </w:r>
+      <w:r>
+        <w:rPr>
+          <w:rFonts w:ascii="Times New Roman" w:hAnsi="Times New Roman" w:cs="Times New Roman"/>
+        </w:rPr>
+        <w:t>.</w:t>
+      </w:r>
+    </w:p>
+    <w:p>
+      <w:pPr>
+        <w:rPr>
+          <w:rFonts w:ascii="Times New Roman" w:hAnsi="Times New Roman" w:cs="Times New Roman"/>
+        </w:rPr>
+      </w:pPr>
+    </w:p>
+    <w:p>
+      <w:pPr>
+        <w:rPr>
+          <w:rFonts w:ascii="Times New Roman" w:hAnsi="Times New Roman" w:cs="Times New Roman"/>
+        </w:rPr>
+      </w:pPr>
+      <w:r>
+        <w:rPr>
+          <w:rFonts w:ascii="Times New Roman" w:hAnsi="Times New Roman" w:cs="Times New Roman"/>
+        </w:rPr>
+        <w:t>I had to use another source for this:</w:t>
+      </w:r>
+    </w:p>
+    <w:p>
+      <w:pPr>
+        <w:rPr>
+          <w:rFonts w:ascii="Times New Roman" w:hAnsi="Times New Roman" w:cs="Times New Roman"/>
+        </w:rPr>
+      </w:pPr>
+      <w:r>
+        <w:rPr>
+          <w:rFonts w:ascii="Times New Roman" w:hAnsi="Times New Roman" w:cs="Times New Roman"/>
+        </w:rPr>
+        <w:t>The Element</w:t>
+      </w:r>
+      <w:r>
+        <w:rPr>
+          <w:rFonts w:ascii="Times New Roman" w:hAnsi="Times New Roman" w:cs="Times New Roman"/>
+        </w:rPr>
+        <w:t>s of Statistical Learning</w:t>
+      </w:r>
+    </w:p>
+    <w:p>
+      <w:pPr>
+        <w:rPr>
+          <w:rFonts w:ascii="Times New Roman" w:hAnsi="Times New Roman" w:cs="Times New Roman"/>
+        </w:rPr>
+      </w:pPr>
+      <w:r>
+        <w:rPr>
+          <w:rFonts w:ascii="Times New Roman" w:hAnsi="Times New Roman" w:cs="Times New Roman"/>
+        </w:rPr>
+        <w:t>The information came from 10.6 and I will also be putting the pdf in the repo so you guys can access it to check my work.</w:t>
       </w:r>
     </w:p>
     <w:sectPr>

</xml_diff>